<commit_message>
Lito Sousa: revisão crítica da Parte 1
Co-Authored-By: Claude Opus 5.5 <noreply@anthropic.com>
Claude-Session: https://claude.ai/code/session_01MJjUEEZrxQDEUifKK2vj9g
</commit_message>
<xml_diff>
--- a/roteiros/lito-sousa/LitoSousa_Parte1_Introducao.docx
+++ b/roteiros/lito-sousa/LitoSousa_Parte1_Introducao.docx
@@ -31,7 +31,7 @@
         <w:rPr>
           <w:color w:val="C00000"/>
         </w:rPr>
-        <w:t>Fique até o final, porque você vai descobrir o que realmente está acontecendo com ele. E por que a mulher que não sai do lado dele virou alvo de ataques tão cruéis.</w:t>
+        <w:t>Fique até o final, porque você vai descobrir o que os médicos encontraram. E por que a mulher que não sai do lado dele virou alvo de ataques tão brutais.</w:t>
       </w:r>
     </w:p>
     <w:p>
@@ -71,7 +71,7 @@
         <w:rPr>
           <w:color w:val="000000"/>
         </w:rPr>
-        <w:t>Uma casa simples. Cinco irmãos. Pouco dinheiro e muita gente dividindo o mesmo teto.</w:t>
+        <w:t>Era uma família de origem humilde. Lito cresceu cercado de irmãos.</w:t>
       </w:r>
     </w:p>
     <w:p>
@@ -135,7 +135,7 @@
         <w:rPr>
           <w:color w:val="000000"/>
         </w:rPr>
-        <w:t>Aos dezenove anos, entrou num curso técnico da Força Aérea Brasileira. Aprendeu a abrir motores, a ler manuais, a encontrar o defeito escondido que ninguém mais via.</w:t>
+        <w:t>Aos dezenove anos, entrou num curso técnico da Força Aérea Brasileira. Aprendeu a abrir motores e a procurar o defeito escondido que ninguém mais via.</w:t>
       </w:r>
     </w:p>
     <w:p>
@@ -151,14 +151,6 @@
         <w:rPr>
           <w:color w:val="000000"/>
         </w:rPr>
-        <w:t>Era um mecânico novato num hangar cheio de homens mais velhos.</w:t>
-      </w:r>
-    </w:p>
-    <w:p>
-      <w:r>
-        <w:rPr>
-          <w:color w:val="000000"/>
-        </w:rPr>
         <w:t>Em dois anos, virou inspetor. Passou a ser um dos responsáveis por conferir se um avião estava pronto para voar com passageiros.</w:t>
       </w:r>
     </w:p>
@@ -167,7 +159,7 @@
         <w:rPr>
           <w:color w:val="000000"/>
         </w:rPr>
-        <w:t>A vida de centenas de pessoas dependia, todos os dias, da assinatura de um rapaz de vinte e poucos anos.</w:t>
+        <w:t>A segurança de centenas de passageiros passava, todos os dias, pelas mãos de um rapaz de vinte e poucos anos.</w:t>
       </w:r>
     </w:p>
     <w:p>

</xml_diff>

<commit_message>
Lito Sousa: amplia roteiro com material verificado
Co-Authored-By: Claude Opus 5.5 <noreply@anthropic.com>
Claude-Session: https://claude.ai/code/session_01MJjUEEZrxQDEUifKK2vj9g
</commit_message>
<xml_diff>
--- a/roteiros/lito-sousa/LitoSousa_Parte1_Introducao.docx
+++ b/roteiros/lito-sousa/LitoSousa_Parte1_Introducao.docx
@@ -167,7 +167,7 @@
         <w:rPr>
           <w:color w:val="000000"/>
         </w:rPr>
-        <w:t>Nos anos noventa, numa das fases mais marcantes da carreira, Lito foi trabalhar como mecânico no Zaire, no coração da África.</w:t>
+        <w:t>Nos anos noventa, Lito recebeu uma missão que mudaria a forma como ele enxergava os aviões.</w:t>
       </w:r>
     </w:p>
     <w:p>
@@ -175,7 +175,7 @@
         <w:rPr>
           <w:color w:val="000000"/>
         </w:rPr>
-        <w:t>O país vivia uma crise profunda. Manter um avião voando ali era um desafio diário.</w:t>
+        <w:t>A Varig tinha aposentado uma frota de aviões antigos, os Lockheed Electra. Turbo-hélices que durante décadas fizeram a ponte aérea entre o Rio de Janeiro e São Paulo.</w:t>
       </w:r>
     </w:p>
     <w:p>
@@ -183,7 +183,31 @@
         <w:rPr>
           <w:color w:val="000000"/>
         </w:rPr>
-        <w:t>Lá, ele conviveu com aviões que operavam no limite.</w:t>
+        <w:t>Esses aviões foram vendidos para o Zaire, no coração da África. E alguém precisava ir junto, para colocá-los de volta no ar.</w:t>
+      </w:r>
+    </w:p>
+    <w:p>
+      <w:r>
+        <w:rPr>
+          <w:color w:val="000000"/>
+        </w:rPr>
+        <w:t>Lito foi um dos escolhidos. Ficou responsável por supervisionar a volta daqueles aviões à operação.</w:t>
+      </w:r>
+    </w:p>
+    <w:p>
+      <w:r>
+        <w:rPr>
+          <w:color w:val="000000"/>
+        </w:rPr>
+        <w:t>O país vivia uma crise profunda. Não havia internet. As peças eram poucas. Manter um avião daqueles voando, com o mínimo de segurança, era um desafio diário.</w:t>
+      </w:r>
+    </w:p>
+    <w:p>
+      <w:r>
+        <w:rPr>
+          <w:color w:val="000000"/>
+        </w:rPr>
+        <w:t>Lá, ele conviveu com máquinas que operavam no limite.</w:t>
       </w:r>
     </w:p>
     <w:p>
@@ -207,6 +231,14 @@
         <w:rPr>
           <w:color w:val="000000"/>
         </w:rPr>
+        <w:t>Na apresentação, o livro faz uma pergunta que acompanharia Lito pelo resto da carreira. Quais são os limites de um avião? O quanto ele pode ser castigado até que um acidente aconteça?</w:t>
+      </w:r>
+    </w:p>
+    <w:p>
+      <w:r>
+        <w:rPr>
+          <w:color w:val="000000"/>
+        </w:rPr>
         <w:t>Esse é o primeiro objeto dessa história. Um livro escrito por um mecânico que passou a vida perto de aviões que chegavam ao fim.</w:t>
       </w:r>
     </w:p>
@@ -223,7 +255,15 @@
         <w:rPr>
           <w:color w:val="000000"/>
         </w:rPr>
-        <w:t>Ao longo da carreira, Lito também trabalhou na Transbrasil. E entrou na United Airlines, uma das maiores companhias aéreas do mundo. Ficou lá por cerca de vinte e cinco anos.</w:t>
+        <w:t>Ao longo da carreira, Lito também trabalhou na Transbrasil. E entrou na United Airlines, uma das maiores companhias aéreas do mundo. Ficou lá por cerca de vinte e cinco anos. Chegou a cargos de supervisão na manutenção de aeronaves.</w:t>
+      </w:r>
+    </w:p>
+    <w:p>
+      <w:r>
+        <w:rPr>
+          <w:color w:val="000000"/>
+        </w:rPr>
+        <w:t>Era o tipo de profissional que quase ninguém vê. O passageiro entra no avião, coloca o cinto e nunca pensa no homem que passou a noite no hangar conferindo cada parafuso.</w:t>
       </w:r>
     </w:p>
     <w:p>

</xml_diff>

<commit_message>
Lito Sousa: revisão do roteiro ampliado
Co-Authored-By: Claude Opus 5.5 <noreply@anthropic.com>
Claude-Session: https://claude.ai/code/session_01MJjUEEZrxQDEUifKK2vj9g
</commit_message>
<xml_diff>
--- a/roteiros/lito-sousa/LitoSousa_Parte1_Introducao.docx
+++ b/roteiros/lito-sousa/LitoSousa_Parte1_Introducao.docx
@@ -175,7 +175,7 @@
         <w:rPr>
           <w:color w:val="000000"/>
         </w:rPr>
-        <w:t>A Varig tinha aposentado uma frota de aviões antigos, os Lockheed Electra. Turbo-hélices que durante décadas fizeram a ponte aérea entre o Rio de Janeiro e São Paulo.</w:t>
+        <w:t>A Varig tinha aposentado uma frota de aviões antigos, os Lockheed Electra. Turbo-hélices que, por muitos anos, fizeram a ponte aérea entre o Rio de Janeiro e São Paulo.</w:t>
       </w:r>
     </w:p>
     <w:p>
@@ -199,7 +199,7 @@
         <w:rPr>
           <w:color w:val="000000"/>
         </w:rPr>
-        <w:t>O país vivia uma crise profunda. Não havia internet. As peças eram poucas. Manter um avião daqueles voando, com o mínimo de segurança, era um desafio diário.</w:t>
+        <w:t>O país vivia uma crise profunda. Não havia internet. Os recursos eram mínimos. Manter um avião daqueles voando, com o mínimo de segurança, era um desafio diário.</w:t>
       </w:r>
     </w:p>
     <w:p>

</xml_diff>